<commit_message>
second progress report file
</commit_message>
<xml_diff>
--- a/second_progress_report.docx
+++ b/second_progress_report.docx
@@ -168,10 +168,7 @@
         </w:pBdr>
       </w:pPr>
       <w:r>
-        <w:t xml:space="preserve">In previous report I had proved that we actually are in the need of using PCA and SVD, and cannot differentiate microstructure families by just simple properties. </w:t>
-      </w:r>
-      <w:r>
-        <w:t xml:space="preserve"> </w:t>
+        <w:t xml:space="preserve">In previous report I had proved that we actually are in the need of using PCA and SVD, and cannot differentiate microstructure families by just simple properties.  </w:t>
       </w:r>
     </w:p>
     <w:p>
@@ -209,6 +206,9 @@
         </w:pBdr>
       </w:pPr>
       <w:r>
+        <w:rPr>
+          <w:noProof/>
+        </w:rPr>
         <w:drawing>
           <wp:inline distT="0" distB="0" distL="0" distR="0" wp14:anchorId="5E2B3C4A" wp14:editId="1CE9F5DF">
             <wp:extent cx="5943600" cy="1981200"/>
@@ -271,6 +271,9 @@
         </w:pBdr>
       </w:pPr>
       <w:r>
+        <w:rPr>
+          <w:noProof/>
+        </w:rPr>
         <w:drawing>
           <wp:inline distT="0" distB="0" distL="0" distR="0" wp14:anchorId="6E192F60" wp14:editId="1F8C4408">
             <wp:extent cx="5943600" cy="2026285"/>
@@ -416,6 +419,9 @@
         </w:pBdr>
       </w:pPr>
       <w:r>
+        <w:rPr>
+          <w:noProof/>
+        </w:rPr>
         <w:drawing>
           <wp:inline distT="0" distB="0" distL="0" distR="0" wp14:anchorId="6A27DB88" wp14:editId="7CCBCD4A">
             <wp:extent cx="6389993" cy="2209190"/>
@@ -499,7 +505,13 @@
         <w:t xml:space="preserve">nly </w:t>
       </w:r>
       <w:r>
-        <w:t>the top modes and compare</w:t>
+        <w:t>the top modes and</w:t>
+      </w:r>
+      <w:r>
+        <w:t xml:space="preserve"> proceed to</w:t>
+      </w:r>
+      <w:r>
+        <w:t xml:space="preserve"> compare</w:t>
       </w:r>
       <w:r>
         <w:t xml:space="preserve"> the results.</w:t>
@@ -1236,6 +1248,7 @@
   <w:style w:type="character" w:default="1" w:styleId="DefaultParagraphFont">
     <w:name w:val="Default Paragraph Font"/>
     <w:uiPriority w:val="1"/>
+    <w:semiHidden/>
     <w:unhideWhenUsed/>
   </w:style>
   <w:style w:type="table" w:default="1" w:styleId="TableNormal">

</xml_diff>